<commit_message>
audio: rebuild Scenario 4 with 100% distinct worlds (Night Express Train, Deep-sea Bathyscaphe, Golden Kintsugi Workshop, Desert Oasis Bedouin Tent)
</commit_message>
<xml_diff>
--- a/baza/04_сценарий_точка_опоры_кризис_измена/МЕДИТАЦИИ_СЦЕНАРИЙ_4_ТОЧКА_ОПОРЫ_МАГИГ.docx
+++ b/baza/04_сценарий_точка_опоры_кризис_измена/МЕДИТАЦИИ_СЦЕНАРИЙ_4_ТОЧКА_ОПОРЫ_МАГИГ.docx
@@ -30,7 +30,7 @@
         </w:rPr>
         <w:t>Монументальный свод 4-х трансовых сессий по методу Анатолия Фёдорова (МАГиГ)</w:t>
         <w:br/>
-        <w:t>100% уникальные независимые миры: Каменный грот у родника ➔ Гранитный бункер 3-2-6 ➔ Белый каменный мост и Трон ➔ Кедровая хижина и Золотая нить</w:t>
+        <w:t>100% независимые миры: Ночной поезд (Урок 0) ➔ Титановый батискаф 3-2-6 (Урок 1) ➔ Золотой Кинцуги (Урок 5) ➔ Оазис в пустыне (Бонус)</w:t>
         <w:br/>
         <w:t>Спикер: Федоров Анатолий Игоревич (Семейный психолог, гипнолог, проректор МАГиГ)</w:t>
       </w:r>
@@ -46,7 +46,7 @@
           <w:color w:val="0E6E5D"/>
           <w:sz w:val="26"/>
         </w:rPr>
-        <w:t>🎧 0.0. ВВОДНАЯ РЕСУРСНАЯ МЕДИТАЦИЯ: «ТИХОЕ УБЕЖИЩЕ: ПЕРВАЯ ПОМОЩЬ ПРИ КРИЗИСЕ» (Урок 0, 432 Hz)</w:t>
+        <w:t>🎧 0.0. ВВОДНАЯ РЕСУРСНАЯ МЕДИТАЦИЯ: «НОЧНОЙ ЭКСПРЕСС: ПЕРВАЯ ОСТАНОВКА ШОКА» (Урок 0, 432 Hz)</w:t>
       </w:r>
     </w:p>
     <w:p>
@@ -61,11 +61,13 @@
         </w:rPr>
         <w:t>🧠 ТЕРАПЕВТИЧЕСКИЙ ПАСПОРТ И ПСИХОЛОГИЧЕСКИЕ МИШЕНИ</w:t>
         <w:br/>
-        <w:t>• Главная мишень: Экстренная соматическая помощь при шоке после теста.</w:t>
+        <w:t>• Главная мишень: Снятие первичного шока и оцепенения после теста, остановка внутренней паники.</w:t>
         <w:br/>
-        <w:t>• Индукция: Согревание ладонями груди и живота, древний каменный грот у родника.</w:t>
+        <w:t>• Индукция: Ночной поезд дальнего следования, мерный перестук колес, чай в подстаканнике, право уснуть и не решать.</w:t>
         <w:br/>
-        <w:t>• Параметры: 15–16 мин (~1100 слов) | 432 Hz</w:t>
+        <w:t>• Параметры: 15–16 мин (~1100 слов) | Музыка FlowMusic 432 Hz, Ре минор</w:t>
+        <w:br/>
+        <w:t>• Архитектура Косички: А1 (Купе ночного поезда) ➔ Б1 (Мерное покачивание вагона) ➔ В (Ядро: Жизнь не разрушена, поезд везет к новому утру) ➔ Б2 (Тепло одеяла) ➔ А2 (Тишина пути)</w:t>
       </w:r>
     </w:p>
     <w:p>
@@ -77,85 +79,96 @@
           <w:rFonts w:ascii="Calibri" w:hAnsi="Calibri"/>
           <w:sz w:val="21"/>
         </w:rPr>
-        <w:t>[Музыкальное вступление: мягкий, оберегающий фон 432 Гц — Пауза 8 сек]</w:t>
+        <w:t>[Музыкальное вступление: мягкий, убаюкивающий, низкий эмбиент 432 Гц — Пауза 8 сек]</w:t>
         <w:br/>
         <w:br/>
         <w:t>Здравствуй. [Пауза 4 сек]</w:t>
         <w:br/>
-        <w:t xml:space="preserve">Сядь или ляг так, чтобы тело почувствовало самую крепкую опору. </w:t>
+        <w:t xml:space="preserve">Ты только что завершила тест. И я знаю, что внутри сейчас может быть ледяная пустота, дрожь или ощущение, что весь привычный мир разлетелся на куски. </w:t>
         <w:br/>
-        <w:t>Положи одну ладонь на центр груди, а вторую — на низ живота. [Пауза 4 сек]</w:t>
+        <w:t xml:space="preserve">Услышь меня: прямо сейчас ты в безопасности. Ты дышишь. Ты жива. </w:t>
         <w:br/>
-        <w:t xml:space="preserve">Ты проходишь через острый кризис. Земля ушла из-под ног, внутри холод или дрожь. </w:t>
+        <w:t xml:space="preserve">Тебе не нужно прямо сейчас собирать свою жизнь заново, принимать судьбоносные решения или кому-то что-то доказывать. </w:t>
         <w:br/>
-        <w:t xml:space="preserve">И прямо сейчас услышь: ты жива, ты в безопасности и ты справишься. </w:t>
-        <w:br/>
-        <w:t>Тебе не нужно прямо сейчас ничего решать. Дай себе право на паузу. [Пауза 5 сек]</w:t>
+        <w:t>Дай себе право просто остановиться. [Пауза 5 сек]</w:t>
         <w:br/>
         <w:br/>
-        <w:t xml:space="preserve">Почувствуй тепло своих ладоней. </w:t>
+        <w:t xml:space="preserve">Устройся так, чтобы твое тело могло полностью опереться на поверхность. </w:t>
         <w:br/>
-        <w:t xml:space="preserve">Сделай мягкий вдох носом... и согревающий, долгий выдох через губы. </w:t>
+        <w:t xml:space="preserve">Положи одну ладонь на середину груди, а вторую — на низ живота. </w:t>
         <w:br/>
-        <w:t xml:space="preserve">Тепло ладони на груди успокаивает сердце. </w:t>
-        <w:br/>
-        <w:t xml:space="preserve">Тепло ладони на животе снимает ледяной спазм с внутренних органов. </w:t>
-        <w:br/>
-        <w:t xml:space="preserve">Разомкни зубы, отпусти нижнюю челюсть. </w:t>
-        <w:br/>
-        <w:t xml:space="preserve">Плечи опускаются вниз, отдавая тяжесть опоре. </w:t>
-        <w:br/>
-        <w:t>Земля держит тебя. Ты не упадешь. [Пауза 7 сек]</w:t>
+        <w:t>Почувствуй тепло своих рук. Это тепло твоего собственного тела, которое всегда с тобой. [Пауза 4 сек]</w:t>
         <w:br/>
         <w:br/>
-        <w:t>[Нитка А1: Каменный грот у родника]</w:t>
+        <w:t>Сделай мягкий вдох через нос... [Пауза 3 сек]</w:t>
         <w:br/>
-        <w:t xml:space="preserve">Представь, что ты находишься внутри древнего каменного грота в скале. </w:t>
+        <w:t>И длинный, согревающий выдох через губы. [Пауза 4 сек]</w:t>
         <w:br/>
-        <w:t xml:space="preserve">Здесь горит уютный очаг, а из скалы бьет чистый хрустальный родник. </w:t>
+        <w:t xml:space="preserve">Позволь глазам закрыться. </w:t>
         <w:br/>
-        <w:t xml:space="preserve">Снаружи бушует гроза, но стены грота монолитны. Сюда не долетает ни капли дождя. </w:t>
+        <w:t xml:space="preserve">И представь... что ты садишься в мягкое купе ночного поезда дальнего следования. </w:t>
         <w:br/>
-        <w:t>Ты в полной защищенности. [Пауза 8 сек]</w:t>
+        <w:t xml:space="preserve">За окном мелькают огни ночных станций, идет холодный дождь, но внутри купе — тепло, горит неяркий ночник и пахнет свежим чаем с лимоном в тяжелом мельхиоровом подстаканнике. </w:t>
+        <w:br/>
+        <w:t>Ты ложишься на мягкую полку, укрываешься теплым одеялом. [Пауза 7 сек]</w:t>
         <w:br/>
         <w:br/>
-        <w:t>[Нитка Б1: Соматическое оттаивание]</w:t>
+        <w:t>[Нитка А1: Перестук колес ночного поезда]</w:t>
         <w:br/>
-        <w:t xml:space="preserve">Тепло очага ласково согревает стопы, колени, лицо. </w:t>
+        <w:t xml:space="preserve">Поезд плавно набирает ход. </w:t>
         <w:br/>
-        <w:t xml:space="preserve">Тело постепенно оттаивает, выходя из оцепенения. </w:t>
+        <w:t xml:space="preserve">Мерный, монотонный, надежный перестук колес: тук-тук... тук-тук... </w:t>
         <w:br/>
-        <w:t>Журчание родника убаюкивает ум, смывая шум чужих поступков. [Пауза 8 сек]</w:t>
+        <w:t xml:space="preserve">Этот звук забирает из твоей головы все крутящиеся мысли. </w:t>
+        <w:br/>
+        <w:t xml:space="preserve">Поезд едет сам. Рельсы проложены. Машинист ведет состав сквозь ночь. </w:t>
+        <w:br/>
+        <w:t>Тебе не нужно управлять этим движением. Твоя единственная задача на эту ночь — просто лежать, слушать перестук колес и позволить поезду везти тебя вперед, к новому утру. [Пауза 8 сек]</w:t>
         <w:br/>
         <w:br/>
-        <w:t>[Нитка В: Ядро транса — Нерушимый свет ценности]</w:t>
+        <w:t>[Нитка Б1: Соматическое убаюкивание]</w:t>
         <w:br/>
-        <w:t xml:space="preserve">Осознай в этой тишине: </w:t>
+        <w:t xml:space="preserve">Почувствуй, как легкое покачивание вагона убаюкивает твое тело. </w:t>
         <w:br/>
-        <w:t xml:space="preserve">Что бы ни произошло снаружи — твоя душа, твой внутренний свет и твоя истинная ценность невредимы. </w:t>
+        <w:t xml:space="preserve">Расслабляется поясница. Отпускает спазм в животе. </w:t>
         <w:br/>
-        <w:t xml:space="preserve">Их невозможно отнять чужим выбором. </w:t>
+        <w:t xml:space="preserve">Челюсти размыкаются. Мышцы лица становятся мягкими и спокойными. </w:t>
         <w:br/>
-        <w:t>Твоя задача сейчас — просто дышать, спать, сохранять тело и беречь себя. [Пауза 8 сек]</w:t>
+        <w:t>Тяжесть шока постепенно вытекает из мышц, уступая место спасительному отдыху. [Пауза 7 сек]</w:t>
         <w:br/>
         <w:br/>
-        <w:t>[Закрытие Б2: Тепло в груди]</w:t>
+        <w:t>[Нитка В: Ядро транса — Точка нетронутой жизни]</w:t>
         <w:br/>
-        <w:t xml:space="preserve">Тепло от ладоней наполняет тело силой и покоем. </w:t>
+        <w:t xml:space="preserve">И в этом мерном движении поезда осознай: </w:t>
         <w:br/>
-        <w:t>Дышится ровно и свободно. [Пауза 6 сек]</w:t>
+        <w:t xml:space="preserve">Разрушились внешние обстоятельства. Разрушился старый сценарий. </w:t>
+        <w:br/>
+        <w:t xml:space="preserve">Но сама твоя жизнь, твоя глубинная суть — не разрушена. </w:t>
+        <w:br/>
+        <w:t xml:space="preserve">Она едет в этом поезде. Она в безопасности. </w:t>
+        <w:br/>
+        <w:t>Ты проедешь эту темную ночь. [Пауза 8 сек]</w:t>
         <w:br/>
         <w:br/>
-        <w:t>[Закрытие А2: Родник и очаг]</w:t>
+        <w:t>[Закрытие Б2: Тепло одеяла и мерный пульс]</w:t>
         <w:br/>
-        <w:t>Родник уносит боль. Очаг дарит тепло. Ты под защитой. [Пауза 6 сек]</w:t>
+        <w:t xml:space="preserve">Тепло разливается по всему телу от макушки до стоп. </w:t>
+        <w:br/>
+        <w:t>Дыхание ровное, спокойное, как ход поезда. [Пауза 6 сек]</w:t>
+        <w:br/>
+        <w:br/>
+        <w:t>[Закрытие А2: Ночное купе и тишина пути]</w:t>
+        <w:br/>
+        <w:t xml:space="preserve">За окном шумит ночь, а внутри купе — уют и защита. </w:t>
+        <w:br/>
+        <w:t>Ты в безопасности. [Пауза 6 сек]</w:t>
         <w:br/>
         <w:br/>
         <w:t>[Выход]</w:t>
         <w:br/>
-        <w:t xml:space="preserve">Глубокий вдох... мягкий выдох. </w:t>
+        <w:t xml:space="preserve">Сделай глубокий вдох... мягкий выдох. </w:t>
         <w:br/>
-        <w:t>Пошевели пальцами. Открывай глаза. Ты справишься. [Музыкальное завершение — Пауза 8 сек]</w:t>
+        <w:t>Пошевели пальцами рук. Открывай глаза с ощущением, что ты в пути и ты справишься. [Музыкальное завершение — Пауза 8 сек]</w:t>
       </w:r>
     </w:p>
     <w:p>
@@ -169,7 +182,7 @@
           <w:color w:val="0E6E5D"/>
           <w:sz w:val="26"/>
         </w:rPr>
-        <w:t>🎧 4.1. SOS-ПРАКТИКА: «ЭКСТРЕННОЕ КУПИРОВАНИЕ ПАНИКИ И ШОКА» (Урок 1, 432 Hz)</w:t>
+        <w:t>🎧 4.1. SOS-ПРАКТИКА: «ТИХООКЕАНСКИЙ БАТИСКАФ И МОРАТОРИЙ 14 ДНЕЙ» (Урок 1, 432 Hz)</w:t>
       </w:r>
     </w:p>
     <w:p>
@@ -184,11 +197,13 @@
         </w:rPr>
         <w:t>🧠 ТЕРАПЕВТИЧЕСКИЙ ПАСПОРТ И ПСИХОЛОГИЧЕСКИЕ МИШЕНИ</w:t>
         <w:br/>
-        <w:t>• Главная мишень: Купирование паники и шока, мораторий 14 дней на решения.</w:t>
+        <w:t>• Главная мишень: Экстренное купирование острой паники, блокировка импульсивных разрушительных действий.</w:t>
         <w:br/>
-        <w:t>• Индукция: Дыхательный метроном 3-2-6, чугунные якоря в скалу, высокогорный бункер над грозой.</w:t>
+        <w:t>• Индукция: Дыхательный протокол 3-2-6, титановый глубоководный батискаф, броня против внешнего давления, мораторий 14 дней на любые решения.</w:t>
         <w:br/>
-        <w:t>• Параметры: 16–18 мин (~1250 слов) | 432 Hz</w:t>
+        <w:t>• Параметры: 16–18 мин (~1250 слов) | Музыка FlowMusic 432 Hz, До минор</w:t>
+        <w:br/>
+        <w:t>• Архитектура Косички: А1 (Титановый батискаф) ➔ Б1 (Снятие напряжения с плеч) ➔ В (Ядро: Мораторий 14 дней — капитан не открывает люк в шторм) ➔ Б2 (Тепло и контроль) ➔ А2 (Стабильный дрейф)</w:t>
       </w:r>
     </w:p>
     <w:p>
@@ -200,16 +215,16 @@
           <w:rFonts w:ascii="Calibri" w:hAnsi="Calibri"/>
           <w:sz w:val="21"/>
         </w:rPr>
-        <w:t>[Музыкальное вступление: обволакивающий, низкий гул 432 Гц — Пауза 8 сек]</w:t>
+        <w:t>[Музыкальное вступление: обволакивающий, глубокий низкочастотный гул 432 Гц — Пауза 8 сек]</w:t>
         <w:br/>
         <w:br/>
         <w:t>Положи обе ладони на центр груди — одну поверх другой. [Пауза 4 сек]</w:t>
         <w:br/>
-        <w:t>Почувствуй биение сердца. Если оно колотится — мы бережно берем ритм под контроль. [Пауза 4 сек]</w:t>
+        <w:t>Если внутри бьется паника или колотится сердце — мы бережно берем ритм под контроль. [Пауза 4 сек]</w:t>
         <w:br/>
-        <w:t xml:space="preserve">Дыхание три-два-шесть: </w:t>
+        <w:t xml:space="preserve">Дыхательный протокол три-два-шесть: </w:t>
         <w:br/>
-        <w:t xml:space="preserve">Вдох носом на три: раз... два... три. </w:t>
+        <w:t xml:space="preserve">Вдох носом на три счета: раз... два... три. </w:t>
         <w:br/>
         <w:t xml:space="preserve">Пауза: раз... два. </w:t>
         <w:br/>
@@ -217,61 +232,79 @@
         <w:br/>
         <w:t xml:space="preserve">И еще раз. Вдох: раз, два, три. Пауза... Выдох: раз, два, три, четыре, пять, шесть. </w:t>
         <w:br/>
-        <w:t xml:space="preserve">Пульс замедляется. </w:t>
+        <w:t xml:space="preserve">Пульс выравнивается. </w:t>
         <w:br/>
         <w:t xml:space="preserve">Разомкни зубы, отпусти челюсть — сними немой зажим крика. </w:t>
         <w:br/>
-        <w:t>Плечи опускаются. Дыхание идет глубоко в живот. [Пауза 6 сек]</w:t>
+        <w:t>Дыхание опускается в живот. [Пауза 6 сек]</w:t>
         <w:br/>
         <w:br/>
-        <w:t>[Нитка А1: Высокогорное гранитное убежище над грозой]</w:t>
+        <w:t>[Нитка А1: Глубоководный исследовательский батискаф]</w:t>
         <w:br/>
-        <w:t xml:space="preserve">Представь монолитное гранитное убежище на вершине горы. </w:t>
+        <w:t xml:space="preserve">Представь, что ты находишься внутри глубоководного батискафа. </w:t>
         <w:br/>
-        <w:t xml:space="preserve">Далеко внизу под облаками бушует шторм и молнии. </w:t>
+        <w:t xml:space="preserve">Снаружи — океанская толща, давление в сотни атмосфер и шторм где-то высоко на поверхности. </w:t>
         <w:br/>
-        <w:t xml:space="preserve">Но здесь, выше облаков — метровые гранитные стены, сухость, тепло и тишина. </w:t>
+        <w:t xml:space="preserve">Но стены твоего батискафа сделаны из монолитного титана толщиной в двадцать сантиметров. </w:t>
         <w:br/>
-        <w:t>Шторм не достанет тебя здесь. [Пауза 8 сек]</w:t>
+        <w:t xml:space="preserve">Иллюминатор из толстого кварцевого бронестекла. </w:t>
+        <w:br/>
+        <w:t xml:space="preserve">Никакое внешнее давление, никакие удары волн не способны пробить эту титановую броню. </w:t>
+        <w:br/>
+        <w:t>Внутри сухо, горит мягкая приборная подсветка и тихо работает система жизнеобеспечения. [Пауза 8 сек]</w:t>
         <w:br/>
         <w:br/>
-        <w:t>[Нитка Б1: Чугунные якоря в скалу]</w:t>
+        <w:t>[Нитка Б1: Соматическая титановая защита]</w:t>
         <w:br/>
-        <w:t xml:space="preserve">От стоп сквозь каменный пол в породу скалы уходят тяжелые чугунные якоря. </w:t>
+        <w:t xml:space="preserve">Почувствуй прочность этого титанового корпуса вокруг своего тела. </w:t>
         <w:br/>
-        <w:t xml:space="preserve">Они цепляются за монолит планеты. </w:t>
+        <w:t xml:space="preserve">Он берет на себя все внешнее давление мира. </w:t>
         <w:br/>
-        <w:t>Тебя невозможно опрокинуть. Вся свинцовая тяжесть уходит в камень. [Пауза 8 сек]</w:t>
+        <w:t xml:space="preserve">Тебе не нужно держать оборону своими мышцами. Броня держит все за тебя. </w:t>
+        <w:br/>
+        <w:t xml:space="preserve">Плечи опускаются. Спина расслабляется в кресле пилота. </w:t>
+        <w:br/>
+        <w:t>Ты в абсолютном, герметичном укрытии. [Пауза 8 сек]</w:t>
         <w:br/>
         <w:br/>
-        <w:t>[Нитка В: Ядро транса — Мораторий 14 дней]</w:t>
+        <w:t>[Нитка В: Ядро транса — Экстренный мораторий 14 дней]</w:t>
         <w:br/>
-        <w:t xml:space="preserve">В шторм капитан держит штурвал и сохраняет судно, не принимая поспешных решений. </w:t>
+        <w:t xml:space="preserve">Услышь главный закон выживания: </w:t>
         <w:br/>
-        <w:t xml:space="preserve">Прямо сейчас объявляется мораторий на любые судьбоносные шаги на четырнадцать дней. </w:t>
+        <w:t xml:space="preserve">Когда приборы фиксируют аномалию за бортом, капитан не совершает резких маневров и не открывает люк. </w:t>
         <w:br/>
-        <w:t xml:space="preserve">Никаких резких действий. Твоя задача — спать, пить воду, беречь тело и дышать. </w:t>
+        <w:t xml:space="preserve">Капитан держит стабильный курс и выжидает. </w:t>
         <w:br/>
-        <w:t>Пыль осядет. Твое убежище несокрушимо. [Пауза 9 сек]</w:t>
+        <w:t xml:space="preserve">Прямо сейчас объявляется строгий мораторий на любые судьбоносные решения на четырнадцать дней. </w:t>
+        <w:br/>
+        <w:t xml:space="preserve">Никаких выяснений отношений. Никаких импульсивных звонков. Никаких резких шагов. </w:t>
+        <w:br/>
+        <w:t xml:space="preserve">Твоя единственная задача на эти две недели — сохранять герметичность: спать, пить теплую воду, кормить тело и дышать. </w:t>
+        <w:br/>
+        <w:t>Пыль осядет. Вода станет прозрачной. И тогда ты увидишь верный путь. [Пауза 9 сек]</w:t>
         <w:br/>
         <w:br/>
-        <w:t>[Закрытие Б2: Тепло в животе]</w:t>
+        <w:t>[Закрытие Б2: Тепло и контроль над телом]</w:t>
         <w:br/>
-        <w:t xml:space="preserve">В животе разгорается мягкое тепло, снимая спазмы. </w:t>
+        <w:t xml:space="preserve">Внутри тела разливается спокойная, плотная уверенность. </w:t>
         <w:br/>
-        <w:t>Тело возвращается под твой контроль. [Пауза 7 сек]</w:t>
+        <w:t xml:space="preserve">Дыхание ровное и глубокое. </w:t>
+        <w:br/>
+        <w:t>Ты держишь штурвал своей жизни. [Пауза 7 сек]</w:t>
         <w:br/>
         <w:br/>
-        <w:t>[Закрытие А2: Лампа и тишина]</w:t>
+        <w:t>[Закрытие А2: Батискаф в ровном дрейфе]</w:t>
         <w:br/>
-        <w:t>Керосиновая лампа на столе горит янтарным светом. Гроза внизу стихает. [Пауза 6 сек]</w:t>
+        <w:t xml:space="preserve">Приборы светят ровным зеленым светом. </w:t>
+        <w:br/>
+        <w:t>Батискаф надежен и стабилен. [Пауза 6 сек]</w:t>
         <w:br/>
         <w:br/>
         <w:t>[Выход]</w:t>
         <w:br/>
-        <w:t xml:space="preserve">Глубокий вдох... выдох. </w:t>
+        <w:t xml:space="preserve">Глубокий вдох... длинный выдох. </w:t>
         <w:br/>
-        <w:t>Ты жива. Ты на своей земле. Открывай глаза. [Музыкальное завершение — Пауза 8 сек]</w:t>
+        <w:t>Пошевели пальцами. Открывай глаза. Ты в безопасности. Твоя броня держит удар. [Музыкальное завершение — Пауза 8 сек]</w:t>
       </w:r>
     </w:p>
     <w:p>
@@ -285,7 +318,7 @@
           <w:color w:val="0E6E5D"/>
           <w:sz w:val="26"/>
         </w:rPr>
-        <w:t>🎧 4.2. МЕДИТАЦИЯ: «МОЯ НЕРУШИМАЯ ОПОРА: МОСТ И ТРОН СУВЕРЕНИТЕТА» (Урок 5, 963 Hz)</w:t>
+        <w:t>🎧 4.2. МЕДИТАЦИЯ: «ЗОЛОТОЙ КИНЦУГИ: СУВЕРЕНИТЕТ И ПЛОТНОСТЬ АЛМАЗА» (Урок 5, 963 Hz)</w:t>
       </w:r>
     </w:p>
     <w:p>
@@ -300,11 +333,13 @@
         </w:rPr>
         <w:t>🧠 ТЕРАПЕВТИЧЕСКИЙ ПАСПОРТ И ПСИХОЛОГИЧЕСКИЕ МИШЕНИ</w:t>
         <w:br/>
-        <w:t>• Главная мишень: Восстановление самооценки, корона авторства судьбы.</w:t>
+        <w:t>• Главная мишень: Преодоление краха самооценки после предательства, обретение алмазного суверенитета.</w:t>
         <w:br/>
-        <w:t>• Индукция: Царственная осанка, белый каменный мост через реку, золотой стержень в позвоночнике.</w:t>
+        <w:t>• Индукция: Искусство Кинцуги, сплавление раны жидким золотом, плотность алмаза («я — алмаз, моя ценность неизменна»), корона автора судьбы.</w:t>
         <w:br/>
-        <w:t>• Параметры: 16–18 мин (~1350 слов) | 963 Hz</w:t>
+        <w:t>• Параметры: 16–18 мин (~1350 слов) | Музыка FlowMusic 963 Hz, До мажор</w:t>
+        <w:br/>
+        <w:t>• Архитектура Косички: А1 (Мастерская Кинцуги) ➔ Б1 (Золотой шов в сердце) ➔ В (Ядро: Плотность алмаза, предательство — не моя вина, возврат короны) ➔ Б2 (Золотое сияние) ➔ А2 (Шедевр новой жизни)</w:t>
       </w:r>
     </w:p>
     <w:p>
@@ -316,72 +351,99 @@
           <w:rFonts w:ascii="Calibri" w:hAnsi="Calibri"/>
           <w:sz w:val="21"/>
         </w:rPr>
-        <w:t>[Музыкальное вступление: торжественный, возвышенный фон 963 Гц — Пауза 8 сек]</w:t>
+        <w:t>[Музыкальное вступление: торжественный, золотой, кристальный фон 963 Гц — Пауза 8 сек]</w:t>
         <w:br/>
         <w:br/>
         <w:t>Здравствуй. [Пауза 4 сек]</w:t>
         <w:br/>
-        <w:t>Сядь с царственной, свободной спиной. Закрой глаза. [Пауза 4 сек]</w:t>
+        <w:t xml:space="preserve">Сядь прямо, раскрой плечи, почувствуй царственную высоту своего позвоночника. </w:t>
         <w:br/>
-        <w:t xml:space="preserve">Сделай вдох светом... и длинный выдох, отпуская все обломки прошлых иллюзий и предательств. </w:t>
+        <w:t>Закрой глаза. [Пауза 4 сек]</w:t>
         <w:br/>
-        <w:t xml:space="preserve">Лицо становится спокойным и величественным. </w:t>
+        <w:t xml:space="preserve">Мы подошли к главному моменту исцеления. </w:t>
         <w:br/>
-        <w:t xml:space="preserve">Челюсть свободна, плечи раскрыты. </w:t>
-        <w:br/>
-        <w:t>Грудь дышит глубоко и просторно. [Пауза 6 сек]</w:t>
+        <w:t>К моменту, когда пережитая боль перестает быть раной и становится твоей высшей силой и мудростью. [Пауза 5 сек]</w:t>
         <w:br/>
         <w:br/>
-        <w:t>[Нитка А1: Каменный мост через реку кризиса]</w:t>
+        <w:t>Сделай медленный вдох, наполняя грудную клетку светом... [Пауза 3 сек]</w:t>
         <w:br/>
-        <w:t xml:space="preserve">Представь перед собой темную реку кризиса. </w:t>
+        <w:t xml:space="preserve">И долгий, свободный выдох, отпуская все остатки самобичевания и горечи. </w:t>
         <w:br/>
-        <w:t xml:space="preserve">Но через нее перекинут широкий, древний каменный мост из белого шлифованного камня. </w:t>
+        <w:t xml:space="preserve">Лицо становится спокойным, благородным и чистым. </w:t>
         <w:br/>
-        <w:t xml:space="preserve">Ты спокойно ступаешь на него. </w:t>
-        <w:br/>
-        <w:t xml:space="preserve">Шаг за шагом боль и предательство остаются на старом берегу. </w:t>
-        <w:br/>
-        <w:t>Твои ноги касаются теплого песчаного берега новой жизни, залитого солнцем. [Пауза 8 сек]</w:t>
+        <w:t>Грудь дышит широко и торжественно. [Пауза 6 сек]</w:t>
         <w:br/>
         <w:br/>
-        <w:t>[Нитка Б1: Золотой титановый стержень]</w:t>
+        <w:t>[Нитка А1: Мастерская древнего искусства Кинцуги]</w:t>
         <w:br/>
-        <w:t xml:space="preserve">Внутри позвоночника от копчика до макушки проходит сияющий золотой титановый стержень. </w:t>
+        <w:t xml:space="preserve">Представь старинную мастерскую мастера Кинцуги. </w:t>
         <w:br/>
-        <w:t xml:space="preserve">Его корни уходят в вечное ядро Земли. </w:t>
+        <w:t xml:space="preserve">На верстаке из темного дерева лежит драгоценная фарфоровая ваза, которая когда-то раскололась от удара. </w:t>
         <w:br/>
-        <w:t xml:space="preserve">Осанка прямая, подбородок приподнят. </w:t>
+        <w:t xml:space="preserve">Но мастер не выбросил ее. </w:t>
         <w:br/>
-        <w:t>Это плотность твоего суверенитета. [Пауза 8 сек]</w:t>
+        <w:t xml:space="preserve">Он взял тонкую кисть и чистейшее жидкое золото. </w:t>
+        <w:br/>
+        <w:t xml:space="preserve">Шов за швом, трещина за трещиной — он соединил осколки золотым лаком. </w:t>
+        <w:br/>
+        <w:t xml:space="preserve">И посмотри на эту вазу теперь. </w:t>
+        <w:br/>
+        <w:t xml:space="preserve">Она стала в десять раз прочнее, чем была раньше. </w:t>
+        <w:br/>
+        <w:t xml:space="preserve">И в сто раз красивее. </w:t>
+        <w:br/>
+        <w:t>Потому что ее золотые шрамы — это не знак дефекта. Это история ее преодоления, ее уникальности и драгоценности. [Пауза 8 сек]</w:t>
         <w:br/>
         <w:br/>
-        <w:t>[Нитка В: Ядро транса — Трон Суверенитета]</w:t>
+        <w:t>[Нитка Б1: Золотой шов в центре сердца]</w:t>
         <w:br/>
-        <w:t xml:space="preserve">Посреди берега стоит белый мраморный Трон Суверенитета. </w:t>
+        <w:t xml:space="preserve">Перенеси внимание в центр своей груди. </w:t>
         <w:br/>
-        <w:t xml:space="preserve">Сядь на него и верни корону авторства своей судьбы: </w:t>
+        <w:t xml:space="preserve">Твоя душевная рана от предательства — прямо сейчас наполняется этим жидким сияющим золотом. </w:t>
         <w:br/>
-        <w:t xml:space="preserve">«Предательство другого — история о его слабости. Оно никак не умаляет мою ценность. </w:t>
+        <w:t xml:space="preserve">Оно обволакивает каждую трещинку, каждый рубец, превращая боль в монолитную золотую спайку. </w:t>
         <w:br/>
-        <w:t>Я — бриллиант чистой воды. Мое достоинство нерушимо. Я выбираю себя». [Пауза 9 сек]</w:t>
+        <w:t xml:space="preserve">Твое сердце становится золотым и несокрушимым. </w:t>
+        <w:br/>
+        <w:t>Ты больше не хрупкая. Ты сплавлена из золота и мудрости. [Пауза 8 сек]</w:t>
         <w:br/>
         <w:br/>
-        <w:t>[Закрытие Б2: Золотой шрам мудрости]</w:t>
+        <w:t>[Нитка В: Ядро транса — Плотность алмаза и Корона авторства]</w:t>
         <w:br/>
-        <w:t>Янтарный свет обволакивает душевную рану жидким золотом, превращая ее в золотой шрам мудрости — знак победы и силы. [Пауза 7 сек]</w:t>
+        <w:t xml:space="preserve">Осознай истину о своей природе: </w:t>
+        <w:br/>
+        <w:t xml:space="preserve">Предательство другого человека определяет лишь уровень его слепоты и слабости, но ни на гран не уменьшает твою ценность. </w:t>
+        <w:br/>
+        <w:t xml:space="preserve">Ты — алмаз чистой воды. </w:t>
+        <w:br/>
+        <w:t xml:space="preserve">Если алмаз уронить в грязь — он остается алмазом. Грязь смывается водой, а грани продолжают сиять вечным огнем. </w:t>
+        <w:br/>
+        <w:t xml:space="preserve">Ты возвращаешь себе корону суверенитета своей жизни: </w:t>
+        <w:br/>
+        <w:t>«Я у себя есть. Мое достоинство нерушимо. Я выбираю себя». [Пауза 9 сек]</w:t>
         <w:br/>
         <w:br/>
-        <w:t>[Закрытие А2: Сияющий горизонт]</w:t>
+        <w:t>[Закрытие Б2: Золотое сияние во всем теле]</w:t>
         <w:br/>
-        <w:t>Впереди — открытый горизонт новой реальности. Сделай уверенный шаг вперед. [Пауза 6 сек]</w:t>
+        <w:t xml:space="preserve">Золотой свет наполняет грудь, поднимается к макушке, согревает ладони. </w:t>
+        <w:br/>
+        <w:t xml:space="preserve">Твоя спина прямая, как клинок. </w:t>
+        <w:br/>
+        <w:t>В тебе нет злости — в тебе есть спокойная, несокрушимая сила. [Пауза 7 сек]</w:t>
+        <w:br/>
+        <w:br/>
+        <w:t>[Закрытие А2: Шедевр новой жизни]</w:t>
+        <w:br/>
+        <w:t xml:space="preserve">Ваза на столе сияет золотом. </w:t>
+        <w:br/>
+        <w:t>Впереди — новая, чистая, величественная глава твоей судьбы. [Пауза 6 сек]</w:t>
         <w:br/>
         <w:br/>
         <w:t>[Выход]</w:t>
         <w:br/>
-        <w:t xml:space="preserve">Глубокий вдох... мощный выдох. </w:t>
+        <w:t xml:space="preserve">Сделай глубокий вдох победы... и мощный выдох. </w:t>
         <w:br/>
-        <w:t>Потянись, чувствуя золотую ось. Открывай глаза хозяйкой своей судьбы. [Музыкальное завершение — Пауза 8 сек]</w:t>
+        <w:t>Потянись к свету. Открывай глаза хозяйкой своей судьбы. [Музыкальное завершение — Пауза 8 сек]</w:t>
       </w:r>
     </w:p>
     <w:p>
@@ -395,7 +457,7 @@
           <w:color w:val="0E6E5D"/>
           <w:sz w:val="26"/>
         </w:rPr>
-        <w:t>🎧 4.3. БОНУСНАЯ АУДИОПРАКТИКА: «КЕДРОВАЯ ХИЖИНА И ЗОЛОТАЯ НИТЬ» (Бонус 2, 432 Hz)</w:t>
+        <w:t>🎧 4.3. БОНУСНАЯ АУДИОПРАКТИКА: «ОАЗИС В ПУСТЫНЕ И ЦЕЛЕБНЫЙ ШАТЕР» (Бонус 2, 432 Hz)</w:t>
       </w:r>
     </w:p>
     <w:p>
@@ -410,11 +472,13 @@
         </w:rPr>
         <w:t>🧠 ТЕРАПЕВТИЧЕСКИЙ ПАСПОРТ И ПСИХОЛОГИЧЕСКИЕ МИШЕНИ</w:t>
         <w:br/>
-        <w:t>• Главная мишень: Исцеление острой душевной боли, стягивание раны.</w:t>
+        <w:t>• Главная мишень: Мягкое снятие остаточной душевной боли и заживление душевных ран.</w:t>
         <w:br/>
-        <w:t>• Индукция: Кедровая хижина над облаками, камин, шерстяной плед, золотая нить.</w:t>
+        <w:t>• Индукция: Шатер в ночном оазисе, шелковые подушки, целебный бальзам из мирры, рассвет над барханами (хронометраж ровно 10 мин).</w:t>
         <w:br/>
-        <w:t>• Параметры: 9–10 мин (~800 слов) | 432 Hz</w:t>
+        <w:t>• Параметры: 9–10 мин (~800 слов) | Музыка FlowMusic 432 Hz, Ля минор</w:t>
+        <w:br/>
+        <w:t>• Архитектура Косички: А1 (Шатер в оазисе) ➔ Б1 (Целебное масло на груди) ➔ В (Ядро: Ночь проходит, жизнь продолжается) ➔ Б2 (Шелковая прохлада) ➔ А2 (Рассвет над барханами)</w:t>
       </w:r>
     </w:p>
     <w:p>
@@ -426,92 +490,88 @@
           <w:rFonts w:ascii="Calibri" w:hAnsi="Calibri"/>
           <w:sz w:val="21"/>
         </w:rPr>
-        <w:t>[Музыкальное вступление: мягкий, убаюкивающий, целебный фон 432 Гц — Пауза 5 сек]</w:t>
+        <w:t>[Музыкальное вступление: теплый, ночной, обволакивающий восточный эмбиент 432 Гц — Пауза 5 сек]</w:t>
         <w:br/>
         <w:br/>
         <w:t>Здравствуй. [Пауза 3 сек]</w:t>
         <w:br/>
-        <w:t>Позволь себе принять самое удобное, мягкое и безопасное положение. [Пауза 4 сек]</w:t>
+        <w:t xml:space="preserve">Устройся мягко и комфортно. </w:t>
         <w:br/>
-        <w:t xml:space="preserve">Почувствуй физическое тепло своего тела. </w:t>
+        <w:t xml:space="preserve">Положи руки на колени или сложи их на груди. </w:t>
         <w:br/>
-        <w:t xml:space="preserve">Прямо сейчас мы бережно признаем ту боль, которая живет внутри. Мы не прячемся от нее, не глушим ее и не боремся с ней. </w:t>
-        <w:br/>
-        <w:t>Ты в безопасности. Ты имеешь право чувствовать. [Пауза 5 сек]</w:t>
+        <w:t>Прямо сейчас мы бережно снимем остаточную душевную боль и дадим твоему сердцу целебный покой. [Пауза 4 сек]</w:t>
         <w:br/>
         <w:br/>
-        <w:t>Сделай мягкий, теплый вдох носом... [Пауза 3 сек]</w:t>
+        <w:t>Сделай медленный вдох носом... [Пауза 3 сек]</w:t>
         <w:br/>
-        <w:t>И длинный, свободный выдох, отпуская внутренний спазм. [Пауза 4 сек]</w:t>
+        <w:t>И длинный, теплый выдох, словно отпускаешь тяжелый вздох. [Пауза 4 сек]</w:t>
         <w:br/>
         <w:t xml:space="preserve">Расслабь лоб... виски. </w:t>
         <w:br/>
-        <w:t xml:space="preserve">Разомкни челюсти, пусть нижняя челюсть станет абсолютно свободной. </w:t>
+        <w:t xml:space="preserve">Разомкни челюсти, пусть лицо станет абсолютно спокойным. </w:t>
         <w:br/>
         <w:t xml:space="preserve">Плечи плавно опускаются. </w:t>
         <w:br/>
-        <w:t>Дыхание становится тихим, ровным и согревающим. [Пауза 6 сек]</w:t>
+        <w:t>Дыхание становится тихим и убаюкивающим. [Пауза 5 сек]</w:t>
         <w:br/>
         <w:br/>
-        <w:t>[Нитка А1: Кедровая хижина над облаками]</w:t>
+        <w:t>[Нитка А1: Шатер в пустынном оазисе]</w:t>
         <w:br/>
-        <w:t xml:space="preserve">Представь себе уютную, крепкую кедровую хижину высоко в горах, далеко над облаками. </w:t>
+        <w:t xml:space="preserve">Представь себе роскошный, уединенный шатер посреди цветущего оазиса в ночной пустыне. </w:t>
         <w:br/>
-        <w:t xml:space="preserve">Воздух здесь пахнет смолой, кедровой хвоей и сухим теплым деревом. </w:t>
+        <w:t xml:space="preserve">Пол устлан мягкими шелковыми коврами и пуховыми подушками. </w:t>
         <w:br/>
-        <w:t xml:space="preserve">В камине тихо и мерно потрескивают дрова, разливая мягкое янтарное сияние. </w:t>
+        <w:t xml:space="preserve">Полог шатра открыт навстречу прохладному ночному ветерку. </w:t>
         <w:br/>
-        <w:t xml:space="preserve">Ты сидишь в глубоком кресле, укутанная в пушистый шерстяной плед. </w:t>
+        <w:t xml:space="preserve">Над головой простирается огромное, кристально чистое южное небо, усыпанное миллиардами крупных звезд. </w:t>
         <w:br/>
-        <w:t>Где-то далеко внизу осталась гроза, а здесь, на вершине — абсолютная тишина, чистота и покой. [Пауза 6 сек]</w:t>
+        <w:t xml:space="preserve">Воздух напоен тонким ароматом сандала, мирры и цветущих финиковых пальм. </w:t>
+        <w:br/>
+        <w:t>Ты лежишь на мягких шелках, чувствуя себя в полной безмятежности. [Пауза 6 сек]</w:t>
         <w:br/>
         <w:br/>
-        <w:t>[Нитка Б1: Гранитная скала под ногами]</w:t>
+        <w:t>[Нитка Б1: Целебный бальзам на сердце]</w:t>
         <w:br/>
-        <w:t xml:space="preserve">Хижина стоит на вековой гранитной скале. </w:t>
+        <w:t xml:space="preserve">В центре шатра стоит маленькая серебряная чаша с драгоценным целебным маслом. </w:t>
         <w:br/>
-        <w:t xml:space="preserve">Почувствуй, как монолитная устойчивость этой скалы передается твоему телу. </w:t>
+        <w:t xml:space="preserve">Представь, как капли этого ароматного, прохладного бальзама мягко касаются твоей груди. </w:t>
         <w:br/>
-        <w:t xml:space="preserve">Оно становится тяжелым, теплым, заземленным. </w:t>
+        <w:t xml:space="preserve">Они мгновенно впитываются, охлаждая воспаленную боль и принося глубокое физическое облегчение. </w:t>
         <w:br/>
-        <w:t>Скала надежно держит тебя, впитывая всю твою усталость, всю слезную тяжесть и дрожь. [Пауза 6 сек]</w:t>
+        <w:t xml:space="preserve">Жар обиды уходит. Спазм растворяется. </w:t>
+        <w:br/>
+        <w:t>Сердце бьется ровно, тихо и свободно. [Пауза 7 сек]</w:t>
         <w:br/>
         <w:br/>
-        <w:t>[Нитка В: Ядро транса — Золотая нить исцеления]</w:t>
+        <w:t>[Нитка В: Ядро транса — Ночь проходит, жизнь продолжается]</w:t>
         <w:br/>
-        <w:t xml:space="preserve">Боль, которую ты сейчас чувствуешь — это не признак твоей слабости. </w:t>
+        <w:t xml:space="preserve">Посмотри на звездное небо над оазисом. </w:t>
         <w:br/>
-        <w:t xml:space="preserve">Это свидетельство того, что у тебя живое, глубокое, любящее человеческое сердце. </w:t>
+        <w:t xml:space="preserve">Звезды светили тысячи лет назад. Они светили в самые темные ночи человечества. </w:t>
         <w:br/>
-        <w:t xml:space="preserve">Но эта боль — временна. </w:t>
+        <w:t xml:space="preserve">И они светят сейчас. </w:t>
         <w:br/>
-        <w:t xml:space="preserve">Твое будущее не разрушено. Разрушилась лишь иллюзия о другом человеке. </w:t>
+        <w:t xml:space="preserve">Твоя боль — это всего лишь темная ночь перед рассветом. </w:t>
         <w:br/>
-        <w:t xml:space="preserve">А твоя жизнь, твоя способность любить, твой свет — продолжаются. </w:t>
+        <w:t xml:space="preserve">Ночь всегда уступает место утру. </w:t>
         <w:br/>
-        <w:t xml:space="preserve">Представь, как тонкая, сияющая золотая нить мягко и бережно стягивает края душевной раны. </w:t>
-        <w:br/>
-        <w:t xml:space="preserve">Стежок за стежком. Бережно и нежно. </w:t>
-        <w:br/>
-        <w:t>Боль утихает, превращаясь в чистый, глубокий опыт и силу. [Пауза 7 сек]</w:t>
+        <w:t>Ты окружена заботой Вселенной. Ты любима. Жизнь продолжается через тебя. [Пауза 7 сек]</w:t>
         <w:br/>
         <w:br/>
-        <w:t>[Закрытие Б2: Золотой уголек в солнечном сплетении]</w:t>
+        <w:t>[Закрытие Б2: Прохлада и умиротворение]</w:t>
         <w:br/>
-        <w:t xml:space="preserve">В солнечном сплетении разгорается теплый золотой уголек. </w:t>
+        <w:t xml:space="preserve">Приятная шелковая прохлада наполняет грудь и плечи. </w:t>
         <w:br/>
-        <w:t xml:space="preserve">Его тепло разливается по животу и груди, растворяя остатки спазма. </w:t>
-        <w:br/>
-        <w:t>Дышится легко, просторно и свободно. [Пауза 5 сек]</w:t>
+        <w:t>Тело легкое, отдохнувшее и обновленное. [Пауза 5 сек]</w:t>
         <w:br/>
         <w:br/>
-        <w:t>[Закрытие А2: Восход солнца над вершинами]</w:t>
+        <w:t>[Закрытие А2: Первые лучи зари над барханами]</w:t>
         <w:br/>
-        <w:t xml:space="preserve">За окном хижины над горными пиками встает огромное, теплое рассветное солнце. </w:t>
+        <w:t xml:space="preserve">На востоке над песчаными барханами загорается нежная розовая полоса рассвета. </w:t>
         <w:br/>
-        <w:t xml:space="preserve">Оно заливает мир золотым светом. </w:t>
+        <w:t xml:space="preserve">Рождается новый, чистый, прекрасный день. </w:t>
         <w:br/>
-        <w:t>Новый день настал. Ты справилась. [Пауза 5 сек]</w:t>
+        <w:t>Ты справилась. [Пауза 5 сек]</w:t>
         <w:br/>
         <w:br/>
         <w:t>[Выход]</w:t>
@@ -520,7 +580,7 @@
         <w:br/>
         <w:t xml:space="preserve">Пошевели пальцами. Открывай глаза. </w:t>
         <w:br/>
-        <w:t>Ты дома. Ты в безопасности. [Музыкальное завершение — Пауза 6 сек]</w:t>
+        <w:t>Ты дома. Ты исцелена. [Музыкальное завершение — Пауза 6 сек]</w:t>
       </w:r>
     </w:p>
     <w:sectPr>

</xml_diff>